<commit_message>
Redo headers in HO_Ex1 explanation docx
</commit_message>
<xml_diff>
--- a/HO_Ex/HO_Ex1_Explanation.docx
+++ b/HO_Ex/HO_Ex1_Explanation.docx
@@ -8,7 +8,7 @@
         <w:jc w:val="left"/>
       </w:pPr>
       <w:r>
-        <w:t>Hands-on Exercise 1</w:t>
+        <w:t>HO_Ex1: Chapter 1 Line-by-Line Explanation</w:t>
       </w:r>
     </w:p>
     <w:p>
@@ -32,7 +32,7 @@
         <w:pStyle w:val="Heading1"/>
       </w:pPr>
       <w:r>
-        <w:t>1.1 Learning Outcome</w:t>
+        <w:t>Learning outcome</w:t>
       </w:r>
     </w:p>
     <w:p>
@@ -48,7 +48,7 @@
         <w:pStyle w:val="Heading1"/>
       </w:pPr>
       <w:r>
-        <w:t>1.2 Getting started</w:t>
+        <w:t>Getting started</w:t>
       </w:r>
     </w:p>
     <w:p>
@@ -56,7 +56,7 @@
         <w:pStyle w:val="Heading2"/>
       </w:pPr>
       <w:r>
-        <w:t>1.2.1 Installing and loading the required libraries</w:t>
+        <w:t>Install and load the required libraries</w:t>
       </w:r>
     </w:p>
     <w:p>
@@ -107,7 +107,7 @@
         <w:pStyle w:val="Heading2"/>
       </w:pPr>
       <w:r>
-        <w:t>1.2.2 Importing data</w:t>
+        <w:t>Import the data</w:t>
       </w:r>
     </w:p>
     <w:p>
@@ -166,7 +166,7 @@
         <w:pStyle w:val="Heading1"/>
       </w:pPr>
       <w:r>
-        <w:t>1.3 Introducing ggplot</w:t>
+        <w:t>Introducing ggplot2</w:t>
       </w:r>
     </w:p>
     <w:p>
@@ -174,7 +174,7 @@
         <w:pStyle w:val="Heading2"/>
       </w:pPr>
       <w:r>
-        <w:t>1.3.1 R Graphics VS ggplot</w:t>
+        <w:t>Base R graphics versus ggplot2</w:t>
       </w:r>
     </w:p>
     <w:p>
@@ -416,7 +416,7 @@
         <w:pStyle w:val="Heading1"/>
       </w:pPr>
       <w:r>
-        <w:t>1.4 Grammar of Graphics</w:t>
+        <w:t>Grammar of graphics</w:t>
       </w:r>
     </w:p>
     <w:p>
@@ -432,7 +432,7 @@
         <w:pStyle w:val="Heading2"/>
       </w:pPr>
       <w:r>
-        <w:t>1.4.1 A Layered Grammar of Graphics</w:t>
+        <w:t>A layered grammar of graphics</w:t>
       </w:r>
     </w:p>
     <w:p>
@@ -448,7 +448,7 @@
         <w:pStyle w:val="Heading1"/>
       </w:pPr>
       <w:r>
-        <w:t>1.5 Essential Grammatical Elements in ggplot2: data</w:t>
+        <w:t>Essential grammatical elements in ggplot2: data</w:t>
       </w:r>
     </w:p>
     <w:p>
@@ -507,7 +507,7 @@
         <w:pStyle w:val="Heading1"/>
       </w:pPr>
       <w:r>
-        <w:t>1.6 Essential Grammatical Elements in ggplot2: Aesthetic mappings</w:t>
+        <w:t>Essential grammatical elements in ggplot2: aesthetic mappings</w:t>
       </w:r>
     </w:p>
     <w:p>
@@ -594,7 +594,7 @@
         <w:pStyle w:val="Heading1"/>
       </w:pPr>
       <w:r>
-        <w:t>1.7 Essential Grammatical Elements in ggplot2: geom</w:t>
+        <w:t>Essential grammatical elements in ggplot2: geoms</w:t>
       </w:r>
     </w:p>
     <w:p>
@@ -610,7 +610,7 @@
         <w:pStyle w:val="Heading2"/>
       </w:pPr>
       <w:r>
-        <w:t>1.7.1 Geometric Objects: geom_bar</w:t>
+        <w:t>Geometric objects: geom_bar</w:t>
       </w:r>
     </w:p>
     <w:p>
@@ -717,7 +717,7 @@
         <w:pStyle w:val="Heading2"/>
       </w:pPr>
       <w:r>
-        <w:t>1.7.2 Geometric Objects: geom_dotplot</w:t>
+        <w:t>Geometric objects: geom_dotplot</w:t>
       </w:r>
     </w:p>
     <w:p>
@@ -1007,7 +1007,7 @@
         <w:pStyle w:val="Heading2"/>
       </w:pPr>
       <w:r>
-        <w:t>1.7.3 Geometric Objects: geom_histogram()</w:t>
+        <w:t>Geometric objects: geom_histogram()</w:t>
       </w:r>
     </w:p>
     <w:p>
@@ -1114,7 +1114,7 @@
         <w:pStyle w:val="Heading2"/>
       </w:pPr>
       <w:r>
-        <w:t>1.7.4 Modifying a geometric object by changing geom()</w:t>
+        <w:t>Modify a geometric object by changing geom()</w:t>
       </w:r>
     </w:p>
     <w:p>
@@ -1277,7 +1277,7 @@
         <w:pStyle w:val="Heading2"/>
       </w:pPr>
       <w:r>
-        <w:t>1.7.5 Modifying a geometric object by changing aes()</w:t>
+        <w:t>Modify a geometric object by changing aes()</w:t>
       </w:r>
     </w:p>
     <w:p>
@@ -1440,7 +1440,7 @@
         <w:pStyle w:val="Heading2"/>
       </w:pPr>
       <w:r>
-        <w:t>1.7.6 Geometric Objects: geom-density()</w:t>
+        <w:t>Geometric objects: geom_density()</w:t>
       </w:r>
     </w:p>
     <w:p>
@@ -1674,7 +1674,7 @@
         <w:pStyle w:val="Heading2"/>
       </w:pPr>
       <w:r>
-        <w:t>1.7.7 Geometric Objects: geom_boxplot</w:t>
+        <w:t>Geometric objects: geom_boxplot</w:t>
       </w:r>
     </w:p>
     <w:p>
@@ -1936,7 +1936,7 @@
         <w:pStyle w:val="Heading2"/>
       </w:pPr>
       <w:r>
-        <w:t>1.7.8 Geometric Objects: geom_violin</w:t>
+        <w:t>Geometric objects: geom_violin</w:t>
       </w:r>
     </w:p>
     <w:p>
@@ -2071,7 +2071,7 @@
         <w:pStyle w:val="Heading2"/>
       </w:pPr>
       <w:r>
-        <w:t>1.7.9 Geometric Objects: geom_point()</w:t>
+        <w:t>Geometric objects: geom_point()</w:t>
       </w:r>
     </w:p>
     <w:p>
@@ -2206,7 +2206,7 @@
         <w:pStyle w:val="Heading2"/>
       </w:pPr>
       <w:r>
-        <w:t>1.7.10 geom objects can be combined</w:t>
+        <w:t>Combine geom objects</w:t>
       </w:r>
     </w:p>
     <w:p>
@@ -2397,7 +2397,7 @@
         <w:pStyle w:val="Heading1"/>
       </w:pPr>
       <w:r>
-        <w:t>1.8 Essential Grammatical Elements in ggplot2: stat</w:t>
+        <w:t>Essential grammatical elements in ggplot2: stats</w:t>
       </w:r>
     </w:p>
     <w:p>
@@ -2413,7 +2413,7 @@
         <w:pStyle w:val="Heading2"/>
       </w:pPr>
       <w:r>
-        <w:t>1.8.1 Working with stat()</w:t>
+        <w:t>Working with stat()</w:t>
       </w:r>
     </w:p>
     <w:p>
@@ -2520,7 +2520,7 @@
         <w:pStyle w:val="Heading2"/>
       </w:pPr>
       <w:r>
-        <w:t>1.8.2 Working with stat - the stat_summary() method</w:t>
+        <w:t>Working with stat: the stat_summary() method</w:t>
       </w:r>
     </w:p>
     <w:p>
@@ -2739,7 +2739,7 @@
         <w:pStyle w:val="Heading2"/>
       </w:pPr>
       <w:r>
-        <w:t>1.8.3 Working with stat - the geom() method</w:t>
+        <w:t>Working with stat: the geom() method</w:t>
       </w:r>
     </w:p>
     <w:p>
@@ -2958,7 +2958,7 @@
         <w:pStyle w:val="Heading2"/>
       </w:pPr>
       <w:r>
-        <w:t>1.8.4 Adding a best fit curve on a scatterplot?</w:t>
+        <w:t>Adding a best-fit curve to a scatterplot</w:t>
       </w:r>
     </w:p>
     <w:p>
@@ -3276,7 +3276,7 @@
         <w:pStyle w:val="Heading1"/>
       </w:pPr>
       <w:r>
-        <w:t>1.9 Essential Grammatical Elements in ggplot2: Facets</w:t>
+        <w:t>Essential grammatical elements in ggplot2: facets</w:t>
       </w:r>
     </w:p>
     <w:p>
@@ -3292,7 +3292,7 @@
         <w:pStyle w:val="Heading2"/>
       </w:pPr>
       <w:r>
-        <w:t>1.9.1 Working with facet_wrap()</w:t>
+        <w:t>Working with facet_wrap()</w:t>
       </w:r>
     </w:p>
     <w:p>
@@ -3427,7 +3427,7 @@
         <w:pStyle w:val="Heading2"/>
       </w:pPr>
       <w:r>
-        <w:t>1.9.2 facet_grid() function</w:t>
+        <w:t>facet_grid()</w:t>
       </w:r>
     </w:p>
     <w:p>
@@ -3562,7 +3562,7 @@
         <w:pStyle w:val="Heading1"/>
       </w:pPr>
       <w:r>
-        <w:t>1.10 Essential Grammatical Elements in ggplot2: Coordinates</w:t>
+        <w:t>Essential grammatical elements in ggplot2: coordinates</w:t>
       </w:r>
     </w:p>
     <w:p>
@@ -3578,7 +3578,7 @@
         <w:pStyle w:val="Heading2"/>
       </w:pPr>
       <w:r>
-        <w:t>1.10.1 Working with Coordinate</w:t>
+        <w:t>Working with coordinate systems</w:t>
       </w:r>
     </w:p>
     <w:p>
@@ -3812,7 +3812,7 @@
         <w:pStyle w:val="Heading2"/>
       </w:pPr>
       <w:r>
-        <w:t>1.10.2 Changing the y- and x-axis range</w:t>
+        <w:t>Changing the y- and x-axis ranges</w:t>
       </w:r>
     </w:p>
     <w:p>
@@ -4158,7 +4158,7 @@
         <w:pStyle w:val="Heading1"/>
       </w:pPr>
       <w:r>
-        <w:t>1.11 Essential Grammatical Elements in ggplot2: themes</w:t>
+        <w:t>Essential grammatical elements in ggplot2: themes</w:t>
       </w:r>
     </w:p>
     <w:p>
@@ -4174,7 +4174,7 @@
         <w:pStyle w:val="Heading2"/>
       </w:pPr>
       <w:r>
-        <w:t>1.11.1 Working with theme</w:t>
+        <w:t>Working with themes</w:t>
       </w:r>
     </w:p>
     <w:p>
@@ -4647,7 +4647,7 @@
         <w:pStyle w:val="Heading1"/>
       </w:pPr>
       <w:r>
-        <w:t>1.12 Reference</w:t>
+        <w:t>Reference</w:t>
       </w:r>
     </w:p>
     <w:p>

</xml_diff>